<commit_message>
feat: add AI agent collaboration architecture docs and update submission files
- docs/agent-architecture.md: PM·Backend·Frontend agent roles,
  MCP server configs (filesystem/postgres/github/puppeteer),
  Skills (claude-api/simplify/security-review/review),
  worktree isolation strategy, settings.json template
- PPT: new slide 7 — Claude multi-agent × MCP architecture diagram
- Word: new section 5 — AI agent collaboration methodology
- Regenerated output files with updated content (12 slides, 10 sections)

Co-Authored-By: Claude Sonnet 4.6 <noreply@anthropic.com>
</commit_message>
<xml_diff>
--- a/PNU-pathfinder/output/개발계획서_PNU-Pathfinder.docx
+++ b/PNU-pathfinder/output/개발계획서_PNU-Pathfinder.docx
@@ -1247,7 +1247,633 @@
           <w:color w:val="003876"/>
           <w:sz w:val="32"/>
         </w:rPr>
-        <w:t>5. 기술 스택</w:t>
+        <w:t>5. AI Agent 협업 개발 방식</w:t>
+      </w:r>
+    </w:p>
+    <w:p>
+      <w:pPr>
+        <w:spacing w:after="80" w:line="360" w:lineRule="exact"/>
+      </w:pPr>
+      <w:r>
+        <w:rPr>
+          <w:rFonts w:eastAsia="맑은 고딕"/>
+          <w:rFonts w:ascii="맑은 고딕" w:hAnsi="맑은 고딕"/>
+          <w:b w:val="0"/>
+          <w:color w:val="000000"/>
+          <w:sz w:val="22"/>
+        </w:rPr>
+        <w:t>본 프로젝트는 단순히 AI 도구를 보조적으로 활용하는 것을 넘어, Claude 멀티 에이전트 시스템과 MCP(Model Context Protocol)를 활용하여 PM·Backend·Frontend Agent가 실제로 역할을 분담하고 협업하는 방식으로 개발된다.</w:t>
+      </w:r>
+    </w:p>
+    <w:p>
+      <w:pPr>
+        <w:spacing w:before="240" w:after="80"/>
+      </w:pPr>
+      <w:r>
+        <w:rPr>
+          <w:rFonts w:eastAsia="맑은 고딕"/>
+          <w:rFonts w:ascii="맑은 고딕" w:hAnsi="맑은 고딕"/>
+          <w:b/>
+          <w:color w:val="057A55"/>
+          <w:sz w:val="26"/>
+        </w:rPr>
+        <w:t>5-1. 에이전트 구성</w:t>
+      </w:r>
+    </w:p>
+    <w:tbl>
+      <w:tblPr>
+        <w:tblStyle w:val="TableGrid"/>
+        <w:tblW w:type="auto" w:w="0"/>
+        <w:tblLook w:firstColumn="1" w:firstRow="1" w:lastColumn="0" w:lastRow="0" w:noHBand="0" w:noVBand="1" w:val="04A0"/>
+      </w:tblPr>
+      <w:tblGrid>
+        <w:gridCol w:w="2209"/>
+        <w:gridCol w:w="2209"/>
+        <w:gridCol w:w="2209"/>
+        <w:gridCol w:w="2209"/>
+      </w:tblGrid>
+      <w:tr>
+        <w:tc>
+          <w:tcPr>
+            <w:tcW w:type="dxa" w:w="1701"/>
+            <w:shd w:fill="003876" w:val="clear"/>
+          </w:tcPr>
+          <w:p>
+            <w:r>
+              <w:rPr>
+                <w:rFonts w:eastAsia="맑은 고딕"/>
+                <w:rFonts w:ascii="맑은 고딕" w:hAnsi="맑은 고딕"/>
+                <w:b/>
+                <w:color w:val="FFFFFF"/>
+                <w:sz w:val="22"/>
+              </w:rPr>
+              <w:t>Agent</w:t>
+            </w:r>
+          </w:p>
+        </w:tc>
+        <w:tc>
+          <w:tcPr>
+            <w:tcW w:type="dxa" w:w="1984"/>
+            <w:shd w:fill="003876" w:val="clear"/>
+          </w:tcPr>
+          <w:p>
+            <w:r>
+              <w:rPr>
+                <w:rFonts w:eastAsia="맑은 고딕"/>
+                <w:rFonts w:ascii="맑은 고딕" w:hAnsi="맑은 고딕"/>
+                <w:b/>
+                <w:color w:val="FFFFFF"/>
+                <w:sz w:val="22"/>
+              </w:rPr>
+              <w:t>모델</w:t>
+            </w:r>
+          </w:p>
+        </w:tc>
+        <w:tc>
+          <w:tcPr>
+            <w:tcW w:type="dxa" w:w="3118"/>
+            <w:shd w:fill="003876" w:val="clear"/>
+          </w:tcPr>
+          <w:p>
+            <w:r>
+              <w:rPr>
+                <w:rFonts w:eastAsia="맑은 고딕"/>
+                <w:rFonts w:ascii="맑은 고딕" w:hAnsi="맑은 고딕"/>
+                <w:b/>
+                <w:color w:val="FFFFFF"/>
+                <w:sz w:val="22"/>
+              </w:rPr>
+              <w:t>담당 역할</w:t>
+            </w:r>
+          </w:p>
+        </w:tc>
+        <w:tc>
+          <w:tcPr>
+            <w:tcW w:type="dxa" w:w="2268"/>
+            <w:shd w:fill="003876" w:val="clear"/>
+          </w:tcPr>
+          <w:p>
+            <w:r>
+              <w:rPr>
+                <w:rFonts w:eastAsia="맑은 고딕"/>
+                <w:rFonts w:ascii="맑은 고딕" w:hAnsi="맑은 고딕"/>
+                <w:b/>
+                <w:color w:val="FFFFFF"/>
+                <w:sz w:val="22"/>
+              </w:rPr>
+              <w:t>MCP 서버</w:t>
+            </w:r>
+          </w:p>
+        </w:tc>
+      </w:tr>
+      <w:tr>
+        <w:tc>
+          <w:tcPr>
+            <w:tcW w:type="dxa" w:w="1701"/>
+          </w:tcPr>
+          <w:p>
+            <w:r>
+              <w:rPr>
+                <w:rFonts w:eastAsia="맑은 고딕"/>
+                <w:rFonts w:ascii="맑은 고딕" w:hAnsi="맑은 고딕"/>
+                <w:b w:val="0"/>
+                <w:color w:val="000000"/>
+                <w:sz w:val="20"/>
+              </w:rPr>
+              <w:t>PM Agent</w:t>
+            </w:r>
+          </w:p>
+        </w:tc>
+        <w:tc>
+          <w:tcPr>
+            <w:tcW w:type="dxa" w:w="1984"/>
+          </w:tcPr>
+          <w:p>
+            <w:r>
+              <w:rPr>
+                <w:rFonts w:eastAsia="맑은 고딕"/>
+                <w:rFonts w:ascii="맑은 고딕" w:hAnsi="맑은 고딕"/>
+                <w:b w:val="0"/>
+                <w:color w:val="000000"/>
+                <w:sz w:val="20"/>
+              </w:rPr>
+              <w:t>Claude Sonnet 4.6</w:t>
+            </w:r>
+          </w:p>
+        </w:tc>
+        <w:tc>
+          <w:tcPr>
+            <w:tcW w:type="dxa" w:w="3118"/>
+          </w:tcPr>
+          <w:p>
+            <w:r>
+              <w:rPr>
+                <w:rFonts w:eastAsia="맑은 고딕"/>
+                <w:rFonts w:ascii="맑은 고딕" w:hAnsi="맑은 고딕"/>
+                <w:b w:val="0"/>
+                <w:color w:val="000000"/>
+                <w:sz w:val="20"/>
+              </w:rPr>
+              <w:t>기획, 문서 작성, 코드 리뷰, 진행 관리</w:t>
+            </w:r>
+          </w:p>
+        </w:tc>
+        <w:tc>
+          <w:tcPr>
+            <w:tcW w:type="dxa" w:w="2268"/>
+          </w:tcPr>
+          <w:p>
+            <w:r>
+              <w:rPr>
+                <w:rFonts w:eastAsia="맑은 고딕"/>
+                <w:rFonts w:ascii="맑은 고딕" w:hAnsi="맑은 고딕"/>
+                <w:b w:val="0"/>
+                <w:color w:val="000000"/>
+                <w:sz w:val="20"/>
+              </w:rPr>
+              <w:t>filesystem, github</w:t>
+            </w:r>
+          </w:p>
+        </w:tc>
+      </w:tr>
+      <w:tr>
+        <w:tc>
+          <w:tcPr>
+            <w:tcW w:type="dxa" w:w="1701"/>
+          </w:tcPr>
+          <w:p>
+            <w:r>
+              <w:rPr>
+                <w:rFonts w:eastAsia="맑은 고딕"/>
+                <w:rFonts w:ascii="맑은 고딕" w:hAnsi="맑은 고딕"/>
+                <w:b w:val="0"/>
+                <w:color w:val="000000"/>
+                <w:sz w:val="20"/>
+              </w:rPr>
+              <w:t>Backend Agent</w:t>
+            </w:r>
+          </w:p>
+        </w:tc>
+        <w:tc>
+          <w:tcPr>
+            <w:tcW w:type="dxa" w:w="1984"/>
+          </w:tcPr>
+          <w:p>
+            <w:r>
+              <w:rPr>
+                <w:rFonts w:eastAsia="맑은 고딕"/>
+                <w:rFonts w:ascii="맑은 고딕" w:hAnsi="맑은 고딕"/>
+                <w:b w:val="0"/>
+                <w:color w:val="000000"/>
+                <w:sz w:val="20"/>
+              </w:rPr>
+              <w:t>Claude Sonnet 4.6</w:t>
+            </w:r>
+          </w:p>
+        </w:tc>
+        <w:tc>
+          <w:tcPr>
+            <w:tcW w:type="dxa" w:w="3118"/>
+          </w:tcPr>
+          <w:p>
+            <w:r>
+              <w:rPr>
+                <w:rFonts w:eastAsia="맑은 고딕"/>
+                <w:rFonts w:ascii="맑은 고딕" w:hAnsi="맑은 고딕"/>
+                <w:b w:val="0"/>
+                <w:color w:val="000000"/>
+                <w:sz w:val="20"/>
+              </w:rPr>
+              <w:t>FastAPI 구현, DB 설계, 추천 로직, OpenAI 연동</w:t>
+            </w:r>
+          </w:p>
+        </w:tc>
+        <w:tc>
+          <w:tcPr>
+            <w:tcW w:type="dxa" w:w="2268"/>
+          </w:tcPr>
+          <w:p>
+            <w:r>
+              <w:rPr>
+                <w:rFonts w:eastAsia="맑은 고딕"/>
+                <w:rFonts w:ascii="맑은 고딕" w:hAnsi="맑은 고딕"/>
+                <w:b w:val="0"/>
+                <w:color w:val="000000"/>
+                <w:sz w:val="20"/>
+              </w:rPr>
+              <w:t>filesystem, postgres, github</w:t>
+            </w:r>
+          </w:p>
+        </w:tc>
+      </w:tr>
+      <w:tr>
+        <w:tc>
+          <w:tcPr>
+            <w:tcW w:type="dxa" w:w="1701"/>
+          </w:tcPr>
+          <w:p>
+            <w:r>
+              <w:rPr>
+                <w:rFonts w:eastAsia="맑은 고딕"/>
+                <w:rFonts w:ascii="맑은 고딕" w:hAnsi="맑은 고딕"/>
+                <w:b w:val="0"/>
+                <w:color w:val="000000"/>
+                <w:sz w:val="20"/>
+              </w:rPr>
+              <w:t>Frontend Agent</w:t>
+            </w:r>
+          </w:p>
+        </w:tc>
+        <w:tc>
+          <w:tcPr>
+            <w:tcW w:type="dxa" w:w="1984"/>
+          </w:tcPr>
+          <w:p>
+            <w:r>
+              <w:rPr>
+                <w:rFonts w:eastAsia="맑은 고딕"/>
+                <w:rFonts w:ascii="맑은 고딕" w:hAnsi="맑은 고딕"/>
+                <w:b w:val="0"/>
+                <w:color w:val="000000"/>
+                <w:sz w:val="20"/>
+              </w:rPr>
+              <w:t>Claude Sonnet 4.6</w:t>
+            </w:r>
+          </w:p>
+        </w:tc>
+        <w:tc>
+          <w:tcPr>
+            <w:tcW w:type="dxa" w:w="3118"/>
+          </w:tcPr>
+          <w:p>
+            <w:r>
+              <w:rPr>
+                <w:rFonts w:eastAsia="맑은 고딕"/>
+                <w:rFonts w:ascii="맑은 고딕" w:hAnsi="맑은 고딕"/>
+                <w:b w:val="0"/>
+                <w:color w:val="000000"/>
+                <w:sz w:val="20"/>
+              </w:rPr>
+              <w:t>React UI 구현, 컴포넌트 작성, API 연동</w:t>
+            </w:r>
+          </w:p>
+        </w:tc>
+        <w:tc>
+          <w:tcPr>
+            <w:tcW w:type="dxa" w:w="2268"/>
+          </w:tcPr>
+          <w:p>
+            <w:r>
+              <w:rPr>
+                <w:rFonts w:eastAsia="맑은 고딕"/>
+                <w:rFonts w:ascii="맑은 고딕" w:hAnsi="맑은 고딕"/>
+                <w:b w:val="0"/>
+                <w:color w:val="000000"/>
+                <w:sz w:val="20"/>
+              </w:rPr>
+              <w:t>filesystem, github, puppeteer</w:t>
+            </w:r>
+          </w:p>
+        </w:tc>
+      </w:tr>
+    </w:tbl>
+    <w:p/>
+    <w:p>
+      <w:pPr>
+        <w:spacing w:before="240" w:after="80"/>
+      </w:pPr>
+      <w:r>
+        <w:rPr>
+          <w:rFonts w:eastAsia="맑은 고딕"/>
+          <w:rFonts w:ascii="맑은 고딕" w:hAnsi="맑은 고딕"/>
+          <w:b/>
+          <w:color w:val="057A55"/>
+          <w:sz w:val="26"/>
+        </w:rPr>
+        <w:t>5-2. MCP 서버별 역할</w:t>
+      </w:r>
+    </w:p>
+    <w:p>
+      <w:pPr>
+        <w:pStyle w:val="ListBullet"/>
+        <w:spacing w:after="40"/>
+        <w:ind w:left="340"/>
+      </w:pPr>
+      <w:r>
+        <w:rPr>
+          <w:rFonts w:eastAsia="맑은 고딕"/>
+          <w:rFonts w:ascii="맑은 고딕" w:hAnsi="맑은 고딕"/>
+          <w:b w:val="0"/>
+          <w:color w:val="000000"/>
+          <w:sz w:val="22"/>
+        </w:rPr>
+        <w:t>filesystem — 각 Agent가 담당 폴더(backend/ 또는 frontend/)의 코드를 직접 읽고 수정</w:t>
+      </w:r>
+    </w:p>
+    <w:p>
+      <w:pPr>
+        <w:pStyle w:val="ListBullet"/>
+        <w:spacing w:after="40"/>
+        <w:ind w:left="340"/>
+      </w:pPr>
+      <w:r>
+        <w:rPr>
+          <w:rFonts w:eastAsia="맑은 고딕"/>
+          <w:rFonts w:ascii="맑은 고딕" w:hAnsi="맑은 고딕"/>
+          <w:b w:val="0"/>
+          <w:color w:val="000000"/>
+          <w:sz w:val="22"/>
+        </w:rPr>
+        <w:t>postgres — Backend Agent가 PostgreSQL DB 스키마를 직접 조회하고 마이그레이션 검증</w:t>
+      </w:r>
+    </w:p>
+    <w:p>
+      <w:pPr>
+        <w:pStyle w:val="ListBullet"/>
+        <w:spacing w:after="40"/>
+        <w:ind w:left="340"/>
+      </w:pPr>
+      <w:r>
+        <w:rPr>
+          <w:rFonts w:eastAsia="맑은 고딕"/>
+          <w:rFonts w:ascii="맑은 고딕" w:hAnsi="맑은 고딕"/>
+          <w:b w:val="0"/>
+          <w:color w:val="000000"/>
+          <w:sz w:val="22"/>
+        </w:rPr>
+        <w:t>github — 모든 Agent가 자신의 작업을 git commit·push하고 PR 생성</w:t>
+      </w:r>
+    </w:p>
+    <w:p>
+      <w:pPr>
+        <w:pStyle w:val="ListBullet"/>
+        <w:spacing w:after="40"/>
+        <w:ind w:left="340"/>
+      </w:pPr>
+      <w:r>
+        <w:rPr>
+          <w:rFonts w:eastAsia="맑은 고딕"/>
+          <w:rFonts w:ascii="맑은 고딕" w:hAnsi="맑은 고딕"/>
+          <w:b w:val="0"/>
+          <w:color w:val="000000"/>
+          <w:sz w:val="22"/>
+        </w:rPr>
+        <w:t>puppeteer — Frontend Agent가 개발 서버에서 UI를 자동으로 스크린샷 촬영하여 렌더링 검증</w:t>
+      </w:r>
+    </w:p>
+    <w:p>
+      <w:pPr>
+        <w:spacing w:before="240" w:after="80"/>
+      </w:pPr>
+      <w:r>
+        <w:rPr>
+          <w:rFonts w:eastAsia="맑은 고딕"/>
+          <w:rFonts w:ascii="맑은 고딕" w:hAnsi="맑은 고딕"/>
+          <w:b/>
+          <w:color w:val="057A55"/>
+          <w:sz w:val="26"/>
+        </w:rPr>
+        <w:t>5-3. Agent Skills</w:t>
+      </w:r>
+    </w:p>
+    <w:p>
+      <w:pPr>
+        <w:pStyle w:val="ListBullet"/>
+        <w:spacing w:after="40"/>
+        <w:ind w:left="340"/>
+      </w:pPr>
+      <w:r>
+        <w:rPr>
+          <w:rFonts w:eastAsia="맑은 고딕"/>
+          <w:rFonts w:ascii="맑은 고딕" w:hAnsi="맑은 고딕"/>
+          <w:b w:val="0"/>
+          <w:color w:val="000000"/>
+          <w:sz w:val="22"/>
+        </w:rPr>
+        <w:t>claude-api (Backend Agent): OpenAI API 연동 패턴, 프롬프트 캐싱 최적화</w:t>
+      </w:r>
+    </w:p>
+    <w:p>
+      <w:pPr>
+        <w:pStyle w:val="ListBullet"/>
+        <w:spacing w:after="40"/>
+        <w:ind w:left="340"/>
+      </w:pPr>
+      <w:r>
+        <w:rPr>
+          <w:rFonts w:eastAsia="맑은 고딕"/>
+          <w:rFonts w:ascii="맑은 고딕" w:hAnsi="맑은 고딕"/>
+          <w:b w:val="0"/>
+          <w:color w:val="000000"/>
+          <w:sz w:val="22"/>
+        </w:rPr>
+        <w:t>simplify (Backend·Frontend Agent): 작성된 코드의 중복 제거 및 품질 자동 검토</w:t>
+      </w:r>
+    </w:p>
+    <w:p>
+      <w:pPr>
+        <w:pStyle w:val="ListBullet"/>
+        <w:spacing w:after="40"/>
+        <w:ind w:left="340"/>
+      </w:pPr>
+      <w:r>
+        <w:rPr>
+          <w:rFonts w:eastAsia="맑은 고딕"/>
+          <w:rFonts w:ascii="맑은 고딕" w:hAnsi="맑은 고딕"/>
+          <w:b w:val="0"/>
+          <w:color w:val="000000"/>
+          <w:sz w:val="22"/>
+        </w:rPr>
+        <w:t>security-review (PM Agent): PR 머지 전 보안 취약점 자동 스캔</w:t>
+      </w:r>
+    </w:p>
+    <w:p>
+      <w:pPr>
+        <w:pStyle w:val="ListBullet"/>
+        <w:spacing w:after="40"/>
+        <w:ind w:left="340"/>
+      </w:pPr>
+      <w:r>
+        <w:rPr>
+          <w:rFonts w:eastAsia="맑은 고딕"/>
+          <w:rFonts w:ascii="맑은 고딕" w:hAnsi="맑은 고딕"/>
+          <w:b w:val="0"/>
+          <w:color w:val="000000"/>
+          <w:sz w:val="22"/>
+        </w:rPr>
+        <w:t>review (PM Agent): 코드 변경사항 전체 리뷰 및 피드백 생성</w:t>
+      </w:r>
+    </w:p>
+    <w:p>
+      <w:pPr>
+        <w:spacing w:before="240" w:after="80"/>
+      </w:pPr>
+      <w:r>
+        <w:rPr>
+          <w:rFonts w:eastAsia="맑은 고딕"/>
+          <w:rFonts w:ascii="맑은 고딕" w:hAnsi="맑은 고딕"/>
+          <w:b/>
+          <w:color w:val="057A55"/>
+          <w:sz w:val="26"/>
+        </w:rPr>
+        <w:t>5-4. 협업 흐름</w:t>
+      </w:r>
+    </w:p>
+    <w:p>
+      <w:pPr>
+        <w:spacing w:after="80" w:line="360" w:lineRule="exact"/>
+      </w:pPr>
+      <w:r>
+        <w:rPr>
+          <w:rFonts w:eastAsia="맑은 고딕"/>
+          <w:rFonts w:ascii="맑은 고딕" w:hAnsi="맑은 고딕"/>
+          <w:b w:val="0"/>
+          <w:color w:val="000000"/>
+          <w:sz w:val="22"/>
+        </w:rPr>
+        <w:t>PM Agent가 PROGRESS.md를 읽어 현재 단계를 파악한 후 태스크를 분류한다. Backend Agent와 Frontend Agent는 worktree 격리 방식으로 병렬 실행되어 충돌 없이 동시 작업한다. 각 Agent의 작업은 git commit으로 자동 기록되며, PM Agent가 PR을 리뷰한 후 develop 브랜치에 병합한다.</w:t>
+      </w:r>
+    </w:p>
+    <w:p>
+      <w:pPr>
+        <w:spacing w:before="240" w:after="80"/>
+      </w:pPr>
+      <w:r>
+        <w:rPr>
+          <w:rFonts w:eastAsia="맑은 고딕"/>
+          <w:rFonts w:ascii="맑은 고딕" w:hAnsi="맑은 고딕"/>
+          <w:b/>
+          <w:color w:val="057A55"/>
+          <w:sz w:val="26"/>
+        </w:rPr>
+        <w:t>5-5. 발표 시 강조 포인트</w:t>
+      </w:r>
+    </w:p>
+    <w:p>
+      <w:pPr>
+        <w:pStyle w:val="ListBullet"/>
+        <w:spacing w:after="40"/>
+        <w:ind w:left="340"/>
+      </w:pPr>
+      <w:r>
+        <w:rPr>
+          <w:rFonts w:eastAsia="맑은 고딕"/>
+          <w:rFonts w:ascii="맑은 고딕" w:hAnsi="맑은 고딕"/>
+          <w:b w:val="0"/>
+          <w:color w:val="000000"/>
+          <w:sz w:val="22"/>
+        </w:rPr>
+        <w:t>AI가 코드를 '제안'하는 수준이 아니라, 실제로 코드를 작성·커밋·PR 생성까지 수행</w:t>
+      </w:r>
+    </w:p>
+    <w:p>
+      <w:pPr>
+        <w:pStyle w:val="ListBullet"/>
+        <w:spacing w:after="40"/>
+        <w:ind w:left="340"/>
+      </w:pPr>
+      <w:r>
+        <w:rPr>
+          <w:rFonts w:eastAsia="맑은 고딕"/>
+          <w:rFonts w:ascii="맑은 고딕" w:hAnsi="맑은 고딕"/>
+          <w:b w:val="0"/>
+          <w:color w:val="000000"/>
+          <w:sz w:val="22"/>
+        </w:rPr>
+        <w:t>postgres MCP를 통해 Backend Agent가 실시간으로 DB 상태를 확인하며 코드 작성</w:t>
+      </w:r>
+    </w:p>
+    <w:p>
+      <w:pPr>
+        <w:pStyle w:val="ListBullet"/>
+        <w:spacing w:after="40"/>
+        <w:ind w:left="340"/>
+      </w:pPr>
+      <w:r>
+        <w:rPr>
+          <w:rFonts w:eastAsia="맑은 고딕"/>
+          <w:rFonts w:ascii="맑은 고딕" w:hAnsi="맑은 고딕"/>
+          <w:b w:val="0"/>
+          <w:color w:val="000000"/>
+          <w:sz w:val="22"/>
+        </w:rPr>
+        <w:t>puppeteer MCP를 통해 Frontend Agent가 UI 렌더링을 자동 검증</w:t>
+      </w:r>
+    </w:p>
+    <w:p>
+      <w:pPr>
+        <w:pStyle w:val="ListBullet"/>
+        <w:spacing w:after="40"/>
+        <w:ind w:left="340"/>
+      </w:pPr>
+      <w:r>
+        <w:rPr>
+          <w:rFonts w:eastAsia="맑은 고딕"/>
+          <w:rFonts w:ascii="맑은 고딕" w:hAnsi="맑은 고딕"/>
+          <w:b w:val="0"/>
+          <w:color w:val="000000"/>
+          <w:sz w:val="22"/>
+        </w:rPr>
+        <w:t>모든 AI 작업 이력이 GitHub 커밋 히스토리로 투명하게 추적 가능</w:t>
+      </w:r>
+    </w:p>
+    <w:p>
+      <w:pPr>
+        <w:spacing w:before="360" w:after="120"/>
+        <w:jc w:val="left"/>
+        <w:pBdr>
+          <w:bottom w:val="single" w:sz="6" w:color="003876"/>
+        </w:pBdr>
+      </w:pPr>
+      <w:r>
+        <w:rPr>
+          <w:rFonts w:eastAsia="맑은 고딕"/>
+          <w:rFonts w:ascii="맑은 고딕" w:hAnsi="맑은 고딕"/>
+          <w:b/>
+          <w:color w:val="003876"/>
+          <w:sz w:val="32"/>
+        </w:rPr>
+        <w:t>6. 기술 스택</w:t>
       </w:r>
     </w:p>
     <w:tbl>
@@ -1706,7 +2332,7 @@
           <w:color w:val="003876"/>
           <w:sz w:val="32"/>
         </w:rPr>
-        <w:t>6. MVP 구현 범위</w:t>
+        <w:t>7. MVP 구현 범위</w:t>
       </w:r>
     </w:p>
     <w:p>
@@ -1721,7 +2347,7 @@
           <w:color w:val="057A55"/>
           <w:sz w:val="26"/>
         </w:rPr>
-        <w:t>6-1. 우선 구현 기능 (해커톤 기간 내)</w:t>
+        <w:t>7-1. 우선 구현 기능 (해커톤 기간 내)</w:t>
       </w:r>
     </w:p>
     <w:p>
@@ -1855,7 +2481,7 @@
           <w:color w:val="057A55"/>
           <w:sz w:val="26"/>
         </w:rPr>
-        <w:t>6-2. 고도화 기능 (추가 구현 목표)</w:t>
+        <w:t>7-2. 고도화 기능 (추가 구현 목표)</w:t>
       </w:r>
     </w:p>
     <w:p>
@@ -1959,7 +2585,7 @@
           <w:color w:val="003876"/>
           <w:sz w:val="32"/>
         </w:rPr>
-        <w:t>7. 개발 일정</w:t>
+        <w:t>8. 개발 일정</w:t>
       </w:r>
     </w:p>
     <w:tbl>
@@ -2418,7 +3044,7 @@
           <w:color w:val="003876"/>
           <w:sz w:val="32"/>
         </w:rPr>
-        <w:t>8. 팀 구성 및 역할 분담</w:t>
+        <w:t>9. 팀 구성 및 역할 분담</w:t>
       </w:r>
     </w:p>
     <w:tbl>
@@ -2718,7 +3344,7 @@
           <w:color w:val="003876"/>
           <w:sz w:val="32"/>
         </w:rPr>
-        <w:t>9. 기대효과 및 차별성</w:t>
+        <w:t>10. 기대효과 및 차별성</w:t>
       </w:r>
     </w:p>
     <w:p>
@@ -2733,7 +3359,7 @@
           <w:color w:val="057A55"/>
           <w:sz w:val="26"/>
         </w:rPr>
-        <w:t>9-1. 차별성</w:t>
+        <w:t>10-1. 차별성</w:t>
       </w:r>
     </w:p>
     <w:p>
@@ -2833,7 +3459,7 @@
           <w:color w:val="057A55"/>
           <w:sz w:val="26"/>
         </w:rPr>
-        <w:t>9-2. 기대효과</w:t>
+        <w:t>10-2. 기대효과</w:t>
       </w:r>
     </w:p>
     <w:p>

</xml_diff>